<commit_message>
lap -> PC: Parelela
</commit_message>
<xml_diff>
--- a/TAREAS 6 SEMESTRE/Interacción Humano Computadora/QuijasContrerasVictorManul28082026P#2.docx
+++ b/TAREAS 6 SEMESTRE/Interacción Humano Computadora/QuijasContrerasVictorManul28082026P#2.docx
@@ -262,15 +262,15 @@
         <mc:AlternateContent>
           <mc:Choice Requires="wps">
             <w:drawing>
-              <wp:anchor distT="0" distB="0" distL="114300" distR="114300" simplePos="0" relativeHeight="251657728" behindDoc="0" locked="0" layoutInCell="1" allowOverlap="1" wp14:anchorId="12F471F9" wp14:editId="4566EB5C">
+              <wp:anchor distT="0" distB="0" distL="114300" distR="114300" simplePos="0" relativeHeight="251657728" behindDoc="0" locked="0" layoutInCell="1" allowOverlap="1" wp14:anchorId="12F471F9" wp14:editId="047144E0">
                 <wp:simplePos x="0" y="0"/>
                 <wp:positionH relativeFrom="margin">
-                  <wp:posOffset>-15240</wp:posOffset>
+                  <wp:posOffset>-13335</wp:posOffset>
                 </wp:positionH>
                 <wp:positionV relativeFrom="paragraph">
-                  <wp:posOffset>290195</wp:posOffset>
+                  <wp:posOffset>289137</wp:posOffset>
                 </wp:positionV>
-                <wp:extent cx="5347335" cy="857250"/>
+                <wp:extent cx="5347335" cy="999066"/>
                 <wp:effectExtent l="0" t="0" r="0" b="0"/>
                 <wp:wrapNone/>
                 <wp:docPr id="1111212547" name="Cuadro de texto 281"/>
@@ -282,7 +282,7 @@
                       <wps:spPr>
                         <a:xfrm>
                           <a:off x="0" y="0"/>
-                          <a:ext cx="5347335" cy="857250"/>
+                          <a:ext cx="5347335" cy="999066"/>
                         </a:xfrm>
                         <a:prstGeom prst="rect">
                           <a:avLst/>
@@ -299,15 +299,15 @@
                               <w:jc w:val="center"/>
                               <w:rPr>
                                 <w:rFonts w:ascii="Book Antiqua" w:hAnsi="Book Antiqua"/>
-                                <w:sz w:val="180"/>
-                                <w:szCs w:val="200"/>
+                                <w:sz w:val="200"/>
+                                <w:szCs w:val="220"/>
                               </w:rPr>
                             </w:pPr>
                             <w:r>
                               <w:rPr>
                                 <w:rFonts w:ascii="Book Antiqua" w:hAnsi="Book Antiqua"/>
-                                <w:sz w:val="72"/>
-                                <w:szCs w:val="96"/>
+                                <w:sz w:val="96"/>
+                                <w:szCs w:val="144"/>
                               </w:rPr>
                               <w:t>Splash</w:t>
                             </w:r>
@@ -338,7 +338,7 @@
                 <v:stroke joinstyle="miter"/>
                 <v:path gradientshapeok="t" o:connecttype="rect"/>
               </v:shapetype>
-              <v:shape id="Cuadro de texto 281" o:spid="_x0000_s1026" type="#_x0000_t202" style="position:absolute;left:0;text-align:left;margin-left:-1.2pt;margin-top:22.85pt;width:421.05pt;height:67.5pt;z-index:251657728;visibility:visible;mso-wrap-style:square;mso-width-percent:0;mso-height-percent:0;mso-wrap-distance-left:9pt;mso-wrap-distance-top:0;mso-wrap-distance-right:9pt;mso-wrap-distance-bottom:0;mso-position-horizontal:absolute;mso-position-horizontal-relative:margin;mso-position-vertical:absolute;mso-position-vertical-relative:text;mso-width-percent:0;mso-height-percent:0;mso-width-relative:margin;mso-height-relative:margin;v-text-anchor:top" o:gfxdata="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" filled="f" stroked="f" strokeweight="4.5pt">
+              <v:shape id="Cuadro de texto 281" o:spid="_x0000_s1026" type="#_x0000_t202" style="position:absolute;left:0;text-align:left;margin-left:-1.05pt;margin-top:22.75pt;width:421.05pt;height:78.65pt;z-index:251657728;visibility:visible;mso-wrap-style:square;mso-width-percent:0;mso-height-percent:0;mso-wrap-distance-left:9pt;mso-wrap-distance-top:0;mso-wrap-distance-right:9pt;mso-wrap-distance-bottom:0;mso-position-horizontal:absolute;mso-position-horizontal-relative:margin;mso-position-vertical:absolute;mso-position-vertical-relative:text;mso-width-percent:0;mso-height-percent:0;mso-width-relative:margin;mso-height-relative:margin;v-text-anchor:top" o:gfxdata="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" filled="f" stroked="f" strokeweight="4.5pt">
                 <v:textbox>
                   <w:txbxContent>
                     <w:p>
@@ -346,15 +346,15 @@
                         <w:jc w:val="center"/>
                         <w:rPr>
                           <w:rFonts w:ascii="Book Antiqua" w:hAnsi="Book Antiqua"/>
-                          <w:sz w:val="180"/>
-                          <w:szCs w:val="200"/>
+                          <w:sz w:val="200"/>
+                          <w:szCs w:val="220"/>
                         </w:rPr>
                       </w:pPr>
                       <w:r>
                         <w:rPr>
                           <w:rFonts w:ascii="Book Antiqua" w:hAnsi="Book Antiqua"/>
-                          <w:sz w:val="72"/>
-                          <w:szCs w:val="96"/>
+                          <w:sz w:val="96"/>
+                          <w:szCs w:val="144"/>
                         </w:rPr>
                         <w:t>Splash</w:t>
                       </w:r>
@@ -575,7 +575,7 @@
               </wp:anchor>
             </w:drawing>
           </mc:Choice>
-          <mc:Fallback xmlns:w16cei="http://schemas.microsoft.com/office/word/2026/wordml/cei">
+          <mc:Fallback>
             <w:pict>
               <v:shape w14:anchorId="5D1D070E" id="Cuadro de texto 282" o:spid="_x0000_s1027" type="#_x0000_t202" style="position:absolute;left:0;text-align:left;margin-left:140pt;margin-top:1.55pt;width:314.25pt;height:31.75pt;z-index:251659776;visibility:visible;mso-wrap-style:square;mso-width-percent:0;mso-height-percent:0;mso-wrap-distance-left:9pt;mso-wrap-distance-top:0;mso-wrap-distance-right:9pt;mso-wrap-distance-bottom:0;mso-position-horizontal:absolute;mso-position-horizontal-relative:page;mso-position-vertical:absolute;mso-position-vertical-relative:text;mso-width-percent:0;mso-height-percent:0;mso-width-relative:margin;mso-height-relative:margin;v-text-anchor:top" o:gfxdata="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" filled="f" stroked="f" strokeweight=".5pt">
                 <v:textbox>
@@ -1445,7 +1445,7 @@
         <w:br w:type="page"/>
       </w:r>
     </w:p>
-    <w:bookmarkStart w:id="0" w:name="_Toc220850609" w:displacedByCustomXml="next"/>
+    <w:bookmarkStart w:id="0" w:name="_Toc238757258" w:displacedByCustomXml="next"/>
     <w:sdt>
       <w:sdtPr>
         <w:rPr>
@@ -1513,7 +1513,7 @@
           <w:r>
             <w:fldChar w:fldCharType="separate"/>
           </w:r>
-          <w:hyperlink w:anchor="_Toc220850609" w:history="1">
+          <w:hyperlink w:anchor="_Toc238757258" w:history="1">
             <w:r>
               <w:rPr>
                 <w:rStyle w:val="Hipervnculo"/>
@@ -1541,7 +1541,7 @@
                 <w:noProof/>
                 <w:webHidden/>
               </w:rPr>
-              <w:instrText xml:space="preserve"> PAGEREF _Toc220850609 \h </w:instrText>
+              <w:instrText xml:space="preserve"> PAGEREF _Toc238757258 \h </w:instrText>
             </w:r>
             <w:r>
               <w:rPr>
@@ -1584,7 +1584,7 @@
               <w:color w:val="auto"/>
             </w:rPr>
           </w:pPr>
-          <w:hyperlink w:anchor="_Toc220850610" w:history="1">
+          <w:hyperlink w:anchor="_Toc238757259" w:history="1">
             <w:r>
               <w:rPr>
                 <w:rStyle w:val="Hipervnculo"/>
@@ -1611,7 +1611,7 @@
                 <w:noProof/>
                 <w:webHidden/>
               </w:rPr>
-              <w:instrText xml:space="preserve"> PAGEREF _Toc220850610 \h </w:instrText>
+              <w:instrText xml:space="preserve"> PAGEREF _Toc238757259 \h </w:instrText>
             </w:r>
             <w:r>
               <w:rPr>
@@ -1654,7 +1654,7 @@
               <w:color w:val="auto"/>
             </w:rPr>
           </w:pPr>
-          <w:hyperlink w:anchor="_Toc220850611" w:history="1">
+          <w:hyperlink w:anchor="_Toc238757260" w:history="1">
             <w:r>
               <w:rPr>
                 <w:rStyle w:val="Hipervnculo"/>
@@ -1681,7 +1681,7 @@
                 <w:noProof/>
                 <w:webHidden/>
               </w:rPr>
-              <w:instrText xml:space="preserve"> PAGEREF _Toc220850611 \h </w:instrText>
+              <w:instrText xml:space="preserve"> PAGEREF _Toc238757260 \h </w:instrText>
             </w:r>
             <w:r>
               <w:rPr>
@@ -1714,7 +1714,7 @@
         </w:p>
         <w:p>
           <w:pPr>
-            <w:pStyle w:val="TDC1"/>
+            <w:pStyle w:val="TDC2"/>
             <w:tabs>
               <w:tab w:val="right" w:leader="dot" w:pos="9111"/>
             </w:tabs>
@@ -1724,13 +1724,13 @@
               <w:color w:val="auto"/>
             </w:rPr>
           </w:pPr>
-          <w:hyperlink w:anchor="_Toc220850612" w:history="1">
+          <w:hyperlink w:anchor="_Toc238757261" w:history="1">
             <w:r>
               <w:rPr>
                 <w:rStyle w:val="Hipervnculo"/>
                 <w:noProof/>
               </w:rPr>
-              <w:t>Conclusión</w:t>
+              <w:t>Contenido</w:t>
             </w:r>
             <w:r>
               <w:rPr>
@@ -1751,7 +1751,7 @@
                 <w:noProof/>
                 <w:webHidden/>
               </w:rPr>
-              <w:instrText xml:space="preserve"> PAGEREF _Toc220850612 \h </w:instrText>
+              <w:instrText xml:space="preserve"> PAGEREF _Toc238757261 \h </w:instrText>
             </w:r>
             <w:r>
               <w:rPr>
@@ -1771,7 +1771,7 @@
                 <w:noProof/>
                 <w:webHidden/>
               </w:rPr>
-              <w:t>1</w:t>
+              <w:t>2</w:t>
             </w:r>
             <w:r>
               <w:rPr>
@@ -1794,7 +1794,7 @@
               <w:color w:val="auto"/>
             </w:rPr>
           </w:pPr>
-          <w:hyperlink w:anchor="_Toc220850613" w:history="1">
+          <w:hyperlink w:anchor="_Toc238757262" w:history="1">
             <w:r>
               <w:rPr>
                 <w:rStyle w:val="Hipervnculo"/>
@@ -1821,7 +1821,7 @@
                 <w:noProof/>
                 <w:webHidden/>
               </w:rPr>
-              <w:instrText xml:space="preserve"> PAGEREF _Toc220850613 \h </w:instrText>
+              <w:instrText xml:space="preserve"> PAGEREF _Toc238757262 \h </w:instrText>
             </w:r>
             <w:r>
               <w:rPr>
@@ -1841,7 +1841,7 @@
                 <w:noProof/>
                 <w:webHidden/>
               </w:rPr>
-              <w:t>1</w:t>
+              <w:t>3</w:t>
             </w:r>
             <w:r>
               <w:rPr>
@@ -1868,31 +1868,174 @@
       <w:pPr>
         <w:pStyle w:val="Ttulo1"/>
       </w:pPr>
-      <w:bookmarkStart w:id="1" w:name="_Toc220850610"/>
+      <w:bookmarkStart w:id="1" w:name="_Toc238757259"/>
       <w:r>
         <w:t>Tabla de ilustraciones</w:t>
       </w:r>
       <w:bookmarkEnd w:id="1"/>
     </w:p>
     <w:p>
-      <w:fldSimple w:instr=" TOC \h \z \c &quot;Ilustración&quot; ">
+      <w:pPr>
+        <w:pStyle w:val="Tabladeilustraciones"/>
+        <w:tabs>
+          <w:tab w:val="right" w:leader="dot" w:pos="9111"/>
+        </w:tabs>
+        <w:rPr>
+          <w:noProof/>
+        </w:rPr>
+      </w:pPr>
+      <w:r>
+        <w:fldChar w:fldCharType="begin"/>
+      </w:r>
+      <w:r>
+        <w:instrText xml:space="preserve"> TOC \h \z \c "Ilustración" </w:instrText>
+      </w:r>
+      <w:r>
+        <w:fldChar w:fldCharType="separate"/>
+      </w:r>
+      <w:hyperlink w:anchor="_Toc238757255" w:history="1">
         <w:r>
           <w:rPr>
-            <w:b/>
-            <w:bCs/>
+            <w:rStyle w:val="Hipervnculo"/>
             <w:noProof/>
-            <w:lang w:val="es-ES"/>
           </w:rPr>
-          <w:t>No se encuentran elementos de tabla de ilustraciones.</w:t>
+          <w:t>Ilustración 1. Vista Inicio</w:t>
         </w:r>
-      </w:fldSimple>
+        <w:r>
+          <w:rPr>
+            <w:noProof/>
+            <w:webHidden/>
+          </w:rPr>
+          <w:tab/>
+        </w:r>
+        <w:r>
+          <w:rPr>
+            <w:noProof/>
+            <w:webHidden/>
+          </w:rPr>
+          <w:fldChar w:fldCharType="begin"/>
+        </w:r>
+        <w:r>
+          <w:rPr>
+            <w:noProof/>
+            <w:webHidden/>
+          </w:rPr>
+          <w:instrText xml:space="preserve"> PAGEREF _Toc238757255 \h </w:instrText>
+        </w:r>
+        <w:r>
+          <w:rPr>
+            <w:noProof/>
+            <w:webHidden/>
+          </w:rPr>
+        </w:r>
+        <w:r>
+          <w:rPr>
+            <w:noProof/>
+            <w:webHidden/>
+          </w:rPr>
+          <w:fldChar w:fldCharType="separate"/>
+        </w:r>
+        <w:r>
+          <w:rPr>
+            <w:noProof/>
+            <w:webHidden/>
+          </w:rPr>
+          <w:t>2</w:t>
+        </w:r>
+        <w:r>
+          <w:rPr>
+            <w:noProof/>
+            <w:webHidden/>
+          </w:rPr>
+          <w:fldChar w:fldCharType="end"/>
+        </w:r>
+      </w:hyperlink>
+    </w:p>
+    <w:p>
+      <w:pPr>
+        <w:pStyle w:val="Tabladeilustraciones"/>
+        <w:tabs>
+          <w:tab w:val="right" w:leader="dot" w:pos="9111"/>
+        </w:tabs>
+        <w:rPr>
+          <w:noProof/>
+        </w:rPr>
+      </w:pPr>
+      <w:hyperlink w:anchor="_Toc238757256" w:history="1">
+        <w:r>
+          <w:rPr>
+            <w:rStyle w:val="Hipervnculo"/>
+            <w:noProof/>
+          </w:rPr>
+          <w:t>Ilustración 2. Clase Inicio</w:t>
+        </w:r>
+        <w:r>
+          <w:rPr>
+            <w:noProof/>
+            <w:webHidden/>
+          </w:rPr>
+          <w:tab/>
+        </w:r>
+        <w:r>
+          <w:rPr>
+            <w:noProof/>
+            <w:webHidden/>
+          </w:rPr>
+          <w:fldChar w:fldCharType="begin"/>
+        </w:r>
+        <w:r>
+          <w:rPr>
+            <w:noProof/>
+            <w:webHidden/>
+          </w:rPr>
+          <w:instrText xml:space="preserve"> PAGEREF _Toc238757256 \h </w:instrText>
+        </w:r>
+        <w:r>
+          <w:rPr>
+            <w:noProof/>
+            <w:webHidden/>
+          </w:rPr>
+        </w:r>
+        <w:r>
+          <w:rPr>
+            <w:noProof/>
+            <w:webHidden/>
+          </w:rPr>
+          <w:fldChar w:fldCharType="separate"/>
+        </w:r>
+        <w:r>
+          <w:rPr>
+            <w:noProof/>
+            <w:webHidden/>
+          </w:rPr>
+          <w:t>3</w:t>
+        </w:r>
+        <w:r>
+          <w:rPr>
+            <w:noProof/>
+            <w:webHidden/>
+          </w:rPr>
+          <w:fldChar w:fldCharType="end"/>
+        </w:r>
+      </w:hyperlink>
+    </w:p>
+    <w:p>
+      <w:r>
+        <w:rPr>
+          <w:b/>
+          <w:bCs/>
+          <w:noProof/>
+          <w:lang w:val="es-ES"/>
+        </w:rPr>
+        <w:fldChar w:fldCharType="end"/>
+      </w:r>
     </w:p>
     <w:p/>
     <w:p>
       <w:pPr>
         <w:pStyle w:val="Ttulo1"/>
       </w:pPr>
-      <w:bookmarkStart w:id="2" w:name="_Toc220850611"/>
+      <w:bookmarkStart w:id="2" w:name="_Toc238757260"/>
       <w:r>
         <w:t>Desarrollo</w:t>
       </w:r>
@@ -1919,10 +2062,12 @@
       <w:pPr>
         <w:pStyle w:val="Ttulo2"/>
       </w:pPr>
+      <w:bookmarkStart w:id="3" w:name="_Toc238757261"/>
       <w:r>
         <w:lastRenderedPageBreak/>
         <w:t>Contenido</w:t>
       </w:r>
+      <w:bookmarkEnd w:id="3"/>
     </w:p>
     <w:p>
       <w:pPr>
@@ -1999,6 +2144,7 @@
         <w:pStyle w:val="Descripcin"/>
         <w:jc w:val="center"/>
       </w:pPr>
+      <w:bookmarkStart w:id="4" w:name="_Toc238757255"/>
       <w:r>
         <w:t xml:space="preserve">Ilustración </w:t>
       </w:r>
@@ -2013,6 +2159,7 @@
       <w:r>
         <w:t>. Vista Inicio</w:t>
       </w:r>
+      <w:bookmarkEnd w:id="4"/>
     </w:p>
     <w:p>
       <w:r>
@@ -2094,6 +2241,7 @@
         <w:pStyle w:val="Descripcin"/>
         <w:jc w:val="center"/>
       </w:pPr>
+      <w:bookmarkStart w:id="5" w:name="_Toc238757256"/>
       <w:r>
         <w:t xml:space="preserve">Ilustración </w:t>
       </w:r>
@@ -2108,39 +2256,85 @@
       <w:r>
         <w:t>. Clase Inicio</w:t>
       </w:r>
+      <w:bookmarkEnd w:id="5"/>
     </w:p>
     <w:p>
       <w:r>
         <w:tab/>
         <w:t xml:space="preserve">Para la clase correspondiente a esa vista se tuvo que realizar una actividad la cual crea un hilo de ejecución </w:t>
       </w:r>
+      <w:r>
+        <w:t>aparte de el hilo principal del programa. En la imagen podemos observar que se encuentra dentro de un bloque de “try-catch” el cual se encarga de atrapar las excepciones que pueda llegar a generar la sentencia “</w:t>
+      </w:r>
+      <w:proofErr w:type="spellStart"/>
+      <w:r>
+        <w:t>sleep</w:t>
+      </w:r>
+      <w:proofErr w:type="spellEnd"/>
+      <w:r>
+        <w:t xml:space="preserve">”, esto se debe a que puede llegar a ser incompatible con algunos sistemas operativos, o que el hilo no se haya ejecutado de manera correcta. </w:t>
+      </w:r>
     </w:p>
     <w:p>
+      <w:r>
+        <w:tab/>
+        <w:t xml:space="preserve">Finalmente, el hilo manda a llamar a la ventana de inicio para continuar con la ejecución normal del programa. Esto da la impresión de que estuviera cargando el programa, pero realmente solo duerme el hilo, sin embargo, este mismo código podría aprovechase para que en el lugar de </w:t>
+      </w:r>
+      <w:proofErr w:type="spellStart"/>
+      <w:r>
+        <w:t>sleep</w:t>
+      </w:r>
+      <w:proofErr w:type="spellEnd"/>
+      <w:r>
+        <w:t xml:space="preserve"> ejecute comprobaciones o cargue el programa principal.</w:t>
+      </w:r>
+    </w:p>
+    <w:p>
       <w:pPr>
         <w:pStyle w:val="Ttulo1"/>
       </w:pPr>
-      <w:bookmarkStart w:id="3" w:name="_Toc220850613"/>
+      <w:bookmarkStart w:id="6" w:name="_Toc238757262"/>
       <w:r>
         <w:t>Bibliografía</w:t>
       </w:r>
-      <w:bookmarkEnd w:id="3"/>
+      <w:bookmarkEnd w:id="6"/>
     </w:p>
     <w:p>
+      <w:pPr>
+        <w:pStyle w:val="Prrafodelista"/>
+        <w:numPr>
+          <w:ilvl w:val="0"/>
+          <w:numId w:val="33"/>
+        </w:numPr>
+      </w:pPr>
       <w:r>
-        <w:t>Hola soy una bibliografía en formato APA</w:t>
+        <w:rPr>
+          <w:i/>
+          <w:iCs/>
+        </w:rPr>
+        <w:t xml:space="preserve">Android API </w:t>
       </w:r>
+      <w:proofErr w:type="spellStart"/>
       <w:r>
-        <w:t>6</w:t>
+        <w:rPr>
+          <w:i/>
+          <w:iCs/>
+        </w:rPr>
+        <w:t>reference</w:t>
+      </w:r>
+      <w:proofErr w:type="spellEnd"/>
+      <w:r>
+        <w:t xml:space="preserve">. (s/f). Android </w:t>
+      </w:r>
+      <w:proofErr w:type="spellStart"/>
+      <w:r>
+        <w:t>Developers</w:t>
+      </w:r>
+      <w:proofErr w:type="spellEnd"/>
+      <w:r>
+        <w:t>. Recuperado el 28 de agosto de 2026, de https://developer.android.com/reference</w:t>
       </w:r>
     </w:p>
-    <w:p/>
-    <w:p/>
-    <w:p/>
-    <w:p/>
-    <w:p/>
-    <w:p/>
-    <w:p/>
-    <w:p/>
     <w:p/>
     <w:p/>
     <w:p/>
@@ -5345,6 +5539,119 @@
     </w:lvl>
   </w:abstractNum>
   <w:abstractNum w:abstractNumId="28" w15:restartNumberingAfterBreak="0">
+    <w:nsid w:val="69C158C4"/>
+    <w:multiLevelType w:val="hybridMultilevel"/>
+    <w:tmpl w:val="5E429CDC"/>
+    <w:lvl w:ilvl="0" w:tplc="080A0001">
+      <w:start w:val="1"/>
+      <w:numFmt w:val="bullet"/>
+      <w:lvlText w:val=""/>
+      <w:lvlJc w:val="left"/>
+      <w:pPr>
+        <w:ind w:left="720" w:hanging="360"/>
+      </w:pPr>
+      <w:rPr>
+        <w:rFonts w:ascii="Symbol" w:hAnsi="Symbol" w:hint="default"/>
+      </w:rPr>
+    </w:lvl>
+    <w:lvl w:ilvl="1" w:tplc="080A0003" w:tentative="1">
+      <w:start w:val="1"/>
+      <w:numFmt w:val="bullet"/>
+      <w:lvlText w:val="o"/>
+      <w:lvlJc w:val="left"/>
+      <w:pPr>
+        <w:ind w:left="1440" w:hanging="360"/>
+      </w:pPr>
+      <w:rPr>
+        <w:rFonts w:ascii="Courier New" w:hAnsi="Courier New" w:cs="Courier New" w:hint="default"/>
+      </w:rPr>
+    </w:lvl>
+    <w:lvl w:ilvl="2" w:tplc="080A0005" w:tentative="1">
+      <w:start w:val="1"/>
+      <w:numFmt w:val="bullet"/>
+      <w:lvlText w:val=""/>
+      <w:lvlJc w:val="left"/>
+      <w:pPr>
+        <w:ind w:left="2160" w:hanging="360"/>
+      </w:pPr>
+      <w:rPr>
+        <w:rFonts w:ascii="Wingdings" w:hAnsi="Wingdings" w:hint="default"/>
+      </w:rPr>
+    </w:lvl>
+    <w:lvl w:ilvl="3" w:tplc="080A0001" w:tentative="1">
+      <w:start w:val="1"/>
+      <w:numFmt w:val="bullet"/>
+      <w:lvlText w:val=""/>
+      <w:lvlJc w:val="left"/>
+      <w:pPr>
+        <w:ind w:left="2880" w:hanging="360"/>
+      </w:pPr>
+      <w:rPr>
+        <w:rFonts w:ascii="Symbol" w:hAnsi="Symbol" w:hint="default"/>
+      </w:rPr>
+    </w:lvl>
+    <w:lvl w:ilvl="4" w:tplc="080A0003" w:tentative="1">
+      <w:start w:val="1"/>
+      <w:numFmt w:val="bullet"/>
+      <w:lvlText w:val="o"/>
+      <w:lvlJc w:val="left"/>
+      <w:pPr>
+        <w:ind w:left="3600" w:hanging="360"/>
+      </w:pPr>
+      <w:rPr>
+        <w:rFonts w:ascii="Courier New" w:hAnsi="Courier New" w:cs="Courier New" w:hint="default"/>
+      </w:rPr>
+    </w:lvl>
+    <w:lvl w:ilvl="5" w:tplc="080A0005" w:tentative="1">
+      <w:start w:val="1"/>
+      <w:numFmt w:val="bullet"/>
+      <w:lvlText w:val=""/>
+      <w:lvlJc w:val="left"/>
+      <w:pPr>
+        <w:ind w:left="4320" w:hanging="360"/>
+      </w:pPr>
+      <w:rPr>
+        <w:rFonts w:ascii="Wingdings" w:hAnsi="Wingdings" w:hint="default"/>
+      </w:rPr>
+    </w:lvl>
+    <w:lvl w:ilvl="6" w:tplc="080A0001" w:tentative="1">
+      <w:start w:val="1"/>
+      <w:numFmt w:val="bullet"/>
+      <w:lvlText w:val=""/>
+      <w:lvlJc w:val="left"/>
+      <w:pPr>
+        <w:ind w:left="5040" w:hanging="360"/>
+      </w:pPr>
+      <w:rPr>
+        <w:rFonts w:ascii="Symbol" w:hAnsi="Symbol" w:hint="default"/>
+      </w:rPr>
+    </w:lvl>
+    <w:lvl w:ilvl="7" w:tplc="080A0003" w:tentative="1">
+      <w:start w:val="1"/>
+      <w:numFmt w:val="bullet"/>
+      <w:lvlText w:val="o"/>
+      <w:lvlJc w:val="left"/>
+      <w:pPr>
+        <w:ind w:left="5760" w:hanging="360"/>
+      </w:pPr>
+      <w:rPr>
+        <w:rFonts w:ascii="Courier New" w:hAnsi="Courier New" w:cs="Courier New" w:hint="default"/>
+      </w:rPr>
+    </w:lvl>
+    <w:lvl w:ilvl="8" w:tplc="080A0005" w:tentative="1">
+      <w:start w:val="1"/>
+      <w:numFmt w:val="bullet"/>
+      <w:lvlText w:val=""/>
+      <w:lvlJc w:val="left"/>
+      <w:pPr>
+        <w:ind w:left="6480" w:hanging="360"/>
+      </w:pPr>
+      <w:rPr>
+        <w:rFonts w:ascii="Wingdings" w:hAnsi="Wingdings" w:hint="default"/>
+      </w:rPr>
+    </w:lvl>
+  </w:abstractNum>
+  <w:abstractNum w:abstractNumId="29" w15:restartNumberingAfterBreak="0">
     <w:nsid w:val="6E6F759E"/>
     <w:multiLevelType w:val="hybridMultilevel"/>
     <w:tmpl w:val="1CA448FC"/>
@@ -5457,7 +5764,7 @@
       </w:rPr>
     </w:lvl>
   </w:abstractNum>
-  <w:abstractNum w:abstractNumId="29" w15:restartNumberingAfterBreak="0">
+  <w:abstractNum w:abstractNumId="30" w15:restartNumberingAfterBreak="0">
     <w:nsid w:val="784530C1"/>
     <w:multiLevelType w:val="hybridMultilevel"/>
     <w:tmpl w:val="3CF6FE18"/>
@@ -5570,7 +5877,7 @@
       </w:rPr>
     </w:lvl>
   </w:abstractNum>
-  <w:abstractNum w:abstractNumId="30" w15:restartNumberingAfterBreak="0">
+  <w:abstractNum w:abstractNumId="31" w15:restartNumberingAfterBreak="0">
     <w:nsid w:val="7C226B17"/>
     <w:multiLevelType w:val="hybridMultilevel"/>
     <w:tmpl w:val="316EBF58"/>
@@ -5683,7 +5990,7 @@
       </w:rPr>
     </w:lvl>
   </w:abstractNum>
-  <w:abstractNum w:abstractNumId="31" w15:restartNumberingAfterBreak="0">
+  <w:abstractNum w:abstractNumId="32" w15:restartNumberingAfterBreak="0">
     <w:nsid w:val="7C7324D3"/>
     <w:multiLevelType w:val="hybridMultilevel"/>
     <w:tmpl w:val="FBB601F2"/>
@@ -5806,7 +6113,7 @@
     <w:abstractNumId w:val="27"/>
   </w:num>
   <w:num w:numId="4" w16cid:durableId="263998001">
-    <w:abstractNumId w:val="29"/>
+    <w:abstractNumId w:val="30"/>
   </w:num>
   <w:num w:numId="5" w16cid:durableId="1694530711">
     <w:abstractNumId w:val="3"/>
@@ -5815,10 +6122,10 @@
     <w:abstractNumId w:val="26"/>
   </w:num>
   <w:num w:numId="7" w16cid:durableId="1510755812">
-    <w:abstractNumId w:val="31"/>
+    <w:abstractNumId w:val="32"/>
   </w:num>
   <w:num w:numId="8" w16cid:durableId="401295270">
-    <w:abstractNumId w:val="28"/>
+    <w:abstractNumId w:val="29"/>
   </w:num>
   <w:num w:numId="9" w16cid:durableId="1237131580">
     <w:abstractNumId w:val="16"/>
@@ -5857,7 +6164,7 @@
     <w:abstractNumId w:val="7"/>
   </w:num>
   <w:num w:numId="21" w16cid:durableId="1910534101">
-    <w:abstractNumId w:val="30"/>
+    <w:abstractNumId w:val="31"/>
   </w:num>
   <w:num w:numId="22" w16cid:durableId="124473379">
     <w:abstractNumId w:val="8"/>
@@ -5891,6 +6198,9 @@
   </w:num>
   <w:num w:numId="32" w16cid:durableId="1482887219">
     <w:abstractNumId w:val="12"/>
+  </w:num>
+  <w:num w:numId="33" w16cid:durableId="1153177223">
+    <w:abstractNumId w:val="28"/>
   </w:num>
   <w:numIdMacAtCleanup w:val="13"/>
 </w:numbering>
@@ -6374,7 +6684,6 @@
   <w:style w:type="character" w:default="1" w:styleId="Fuentedeprrafopredeter">
     <w:name w:val="Default Paragraph Font"/>
     <w:uiPriority w:val="1"/>
-    <w:semiHidden/>
     <w:unhideWhenUsed/>
   </w:style>
   <w:style w:type="table" w:default="1" w:styleId="Tablanormal">
@@ -7428,6 +7737,17 @@
       <w:i/>
       <w:iCs/>
     </w:rPr>
+  </w:style>
+  <w:style w:type="paragraph" w:styleId="Tabladeilustraciones">
+    <w:name w:val="table of figures"/>
+    <w:basedOn w:val="Normal"/>
+    <w:next w:val="Normal"/>
+    <w:uiPriority w:val="99"/>
+    <w:unhideWhenUsed/>
+    <w:rsid w:val="009C7056"/>
+    <w:pPr>
+      <w:spacing w:after="0"/>
+    </w:pPr>
   </w:style>
 </w:styles>
 </file>

</xml_diff>